<commit_message>
UI Changed & Minor Improvements
</commit_message>
<xml_diff>
--- a/uploads/Sarthak_Saluja_Resume.docx
+++ b/uploads/Sarthak_Saluja_Resume.docx
@@ -45,15 +45,7 @@
           <w:sz w:val="19"/>
           <w:szCs w:val="19"/>
         </w:rPr>
-        <w:t>⌥ github.com/Sarthakk404</w:t>
-      </w:r>
-      <w:r>
-        <w:rPr>
-          <w:color w:val="1A1A1A"/>
-          <w:sz w:val="19"/>
-          <w:szCs w:val="19"/>
-        </w:rPr>
-        <w:t xml:space="preserve">   </w:t>
+        <w:t xml:space="preserve">⌥ github.com/Sarthakk404   </w:t>
       </w:r>
       <w:r>
         <w:rPr>
@@ -124,7 +116,15 @@
           <w:sz w:val="19"/>
           <w:szCs w:val="19"/>
         </w:rPr>
-        <w:t>Python Backend Developer passionate about FastAPI, APIs, and AI-powered applications. Built projects including DevCraft and CodesTrial, AI-driven platforms leveraging Gemini and Groq LLMs. Interested in backend development, cloud technologies, and AI integrations while seeking opportunities to grow as a backend or AI-focused engineer.</w:t>
+        <w:t>Python Backend Developer with hands-on experience building AI-powered platforms using FastAPI, Groq, and Gemini. Built and deployed 3 full-stack projects including PrimoFlux — an AI career platform with real-time job scraping, JWT auth, and dual LLM engine. Looking to contribute to a fast-moving AI/backend team</w:t>
+      </w:r>
+      <w:r>
+        <w:rPr>
+          <w:color w:val="1A1A1A"/>
+          <w:sz w:val="19"/>
+          <w:szCs w:val="19"/>
+        </w:rPr>
+        <w:t>.</w:t>
       </w:r>
     </w:p>
     <w:p>
@@ -211,7 +211,7 @@
           <w:sz w:val="19"/>
           <w:szCs w:val="19"/>
         </w:rPr>
-        <w:t>React (Basic), TailwindCSS, Web Design</w:t>
+        <w:t>React , TailwindCSS, Web Design</w:t>
       </w:r>
     </w:p>
     <w:p>
@@ -337,7 +337,27 @@
           <w:sz w:val="18"/>
           <w:szCs w:val="18"/>
         </w:rPr>
-        <w:t>Python, FastAPI, SQLAlchemy, SQLite, React, TailwindCSS, Gemini 2.0 Flash, Vite</w:t>
+        <w:t xml:space="preserve">Python, FastAPI, SQLAlchemy, SQLite, React, TailwindCSS, </w:t>
+      </w:r>
+      <w:r>
+        <w:rPr>
+          <w:i/>
+          <w:iCs/>
+          <w:color w:val="555555"/>
+          <w:sz w:val="18"/>
+          <w:szCs w:val="18"/>
+        </w:rPr>
+        <w:t>Groq Llama 3.3 70B Versatile</w:t>
+      </w:r>
+      <w:r>
+        <w:rPr>
+          <w:i/>
+          <w:iCs/>
+          <w:color w:val="555555"/>
+          <w:sz w:val="18"/>
+          <w:szCs w:val="18"/>
+        </w:rPr>
+        <w:t>, Vite</w:t>
       </w:r>
     </w:p>
     <w:p>
@@ -404,7 +424,33 @@
           <w:sz w:val="19"/>
           <w:szCs w:val="19"/>
         </w:rPr>
-        <w:t>Generated personalized project ideas, feature breakdowns, and learning paths using structured LLM prompts with Gemini 2.0 Flash API.</w:t>
+        <w:t xml:space="preserve">Generated personalized project ideas, feature breakdowns, and learning paths using structured LLM prompts with </w:t>
+      </w:r>
+      <w:r>
+        <w:rPr>
+          <w:b/>
+          <w:bCs/>
+          <w:color w:val="1A1A1A"/>
+          <w:sz w:val="19"/>
+          <w:szCs w:val="19"/>
+        </w:rPr>
+        <w:t xml:space="preserve">Groq </w:t>
+      </w:r>
+      <w:r>
+        <w:rPr>
+          <w:color w:val="1A1A1A"/>
+          <w:sz w:val="19"/>
+          <w:szCs w:val="19"/>
+        </w:rPr>
+        <w:t xml:space="preserve">Llama 3.3 70B Versatile </w:t>
+      </w:r>
+      <w:r>
+        <w:rPr>
+          <w:color w:val="1A1A1A"/>
+          <w:sz w:val="19"/>
+          <w:szCs w:val="19"/>
+        </w:rPr>
+        <w:t>API.</w:t>
       </w:r>
     </w:p>
     <w:p>
@@ -463,6 +509,94 @@
     </w:p>
     <w:p>
       <w:pPr>
+        <w:spacing w:before="60" w:after="10"/>
+      </w:pPr>
+      <w:r>
+        <w:rPr>
+          <w:b/>
+          <w:bCs/>
+          <w:color w:val="1A1A1A"/>
+          <w:sz w:val="20"/>
+        </w:rPr>
+        <w:t>PrimoFlux – AI-Powered Career Acceleration Platform</w:t>
+      </w:r>
+    </w:p>
+    <w:p>
+      <w:pPr>
+        <w:spacing w:after="8"/>
+      </w:pPr>
+      <w:r>
+        <w:rPr>
+          <w:b/>
+          <w:bCs/>
+          <w:color w:val="555555"/>
+          <w:sz w:val="18"/>
+          <w:szCs w:val="18"/>
+        </w:rPr>
+        <w:t xml:space="preserve">Tech Stack: </w:t>
+      </w:r>
+      <w:r>
+        <w:rPr>
+          <w:i/>
+          <w:iCs/>
+          <w:color w:val="555555"/>
+          <w:sz w:val="18"/>
+          <w:szCs w:val="18"/>
+        </w:rPr>
+        <w:t>Python, FastAPI, React 19, Vite, TailwindCSS, Groq LLaMA 3.3 70B, Gemini API, PostgreSQL, Apify, JWT</w:t>
+      </w:r>
+    </w:p>
+    <w:p>
+      <w:pPr>
+        <w:spacing w:after="12"/>
+      </w:pPr>
+      <w:r>
+        <w:rPr>
+          <w:b/>
+          <w:bCs/>
+          <w:color w:val="555555"/>
+          <w:sz w:val="18"/>
+          <w:szCs w:val="18"/>
+        </w:rPr>
+        <w:t xml:space="preserve">GitHub: </w:t>
+      </w:r>
+      <w:r>
+        <w:rPr>
+          <w:color w:val="1155CC"/>
+          <w:sz w:val="18"/>
+          <w:szCs w:val="18"/>
+        </w:rPr>
+        <w:t>github.com/Sarthakk404/PrimoFlux-AI-Powered-Career-Acceleration-Platform</w:t>
+      </w:r>
+      <w:r>
+        <w:rPr>
+          <w:color w:val="555555"/>
+          <w:sz w:val="18"/>
+          <w:szCs w:val="18"/>
+        </w:rPr>
+        <w:t xml:space="preserve">   |   </w:t>
+      </w:r>
+      <w:r>
+        <w:rPr>
+          <w:b/>
+          <w:bCs/>
+          <w:color w:val="555555"/>
+          <w:sz w:val="18"/>
+          <w:szCs w:val="18"/>
+        </w:rPr>
+        <w:t xml:space="preserve">Live: </w:t>
+      </w:r>
+      <w:r>
+        <w:rPr>
+          <w:color w:val="1155CC"/>
+          <w:sz w:val="18"/>
+          <w:szCs w:val="18"/>
+        </w:rPr>
+        <w:t>primo-flux-ai-powered-career-accele.vercel.app</w:t>
+      </w:r>
+    </w:p>
+    <w:p>
+      <w:pPr>
         <w:pStyle w:val="ListParagraph"/>
         <w:numPr>
           <w:ilvl w:val="0"/>
@@ -476,102 +610,7 @@
           <w:sz w:val="19"/>
           <w:szCs w:val="19"/>
         </w:rPr>
-        <w:t>Integrated Gemini 2.0 Flash API for real-time AI-driven tech stack recommendations and phased development roadmap generation.</w:t>
-      </w:r>
-    </w:p>
-    <w:p>
-      <w:pPr>
-        <w:pStyle w:val="ListParagraph"/>
-        <w:spacing w:before="20" w:after="20"/>
-        <w:ind w:left="360"/>
-      </w:pPr>
-    </w:p>
-    <w:p>
-      <w:pPr>
-        <w:spacing w:before="60" w:after="10"/>
-      </w:pPr>
-      <w:r>
-        <w:rPr>
-          <w:b/>
-          <w:bCs/>
-          <w:color w:val="1A1A1A"/>
-          <w:sz w:val="20"/>
-        </w:rPr>
-        <w:t>CodesTrial – AI-Powered Code Roasting Platform</w:t>
-      </w:r>
-    </w:p>
-    <w:p>
-      <w:pPr>
-        <w:spacing w:after="8"/>
-      </w:pPr>
-      <w:r>
-        <w:rPr>
-          <w:b/>
-          <w:bCs/>
-          <w:color w:val="555555"/>
-          <w:sz w:val="18"/>
-          <w:szCs w:val="18"/>
-        </w:rPr>
-        <w:t xml:space="preserve">Tech Stack: </w:t>
-      </w:r>
-      <w:r>
-        <w:rPr>
-          <w:i/>
-          <w:iCs/>
-          <w:color w:val="555555"/>
-          <w:sz w:val="18"/>
-          <w:szCs w:val="18"/>
-        </w:rPr>
-        <w:t>Python, FastAPI, Pydantic, React 18, Vite, Groq LLaMA 3.3, Imgflip API</w:t>
-      </w:r>
-    </w:p>
-    <w:p>
-      <w:pPr>
-        <w:spacing w:after="12"/>
-      </w:pPr>
-      <w:r>
-        <w:rPr>
-          <w:b/>
-          <w:bCs/>
-          <w:color w:val="555555"/>
-          <w:sz w:val="18"/>
-          <w:szCs w:val="18"/>
-        </w:rPr>
-        <w:t xml:space="preserve">GitHub: </w:t>
-      </w:r>
-      <w:r>
-        <w:rPr>
-          <w:color w:val="1155CC"/>
-          <w:sz w:val="18"/>
-          <w:szCs w:val="18"/>
-        </w:rPr>
-        <w:t>github.com/Sarthakk404/CodesTrial-AI-Powered-Code-Roasting</w:t>
-      </w:r>
-      <w:r>
-        <w:rPr>
-          <w:color w:val="555555"/>
-          <w:sz w:val="18"/>
-          <w:szCs w:val="18"/>
-        </w:rPr>
-        <w:t xml:space="preserve">   |   </w:t>
-      </w:r>
-      <w:r>
-        <w:rPr>
-          <w:b/>
-          <w:bCs/>
-          <w:color w:val="555555"/>
-          <w:sz w:val="18"/>
-          <w:szCs w:val="18"/>
-        </w:rPr>
-        <w:t xml:space="preserve">Live: </w:t>
-      </w:r>
-      <w:r>
-        <w:rPr>
-          <w:color w:val="1155CC"/>
-          <w:sz w:val="18"/>
-          <w:szCs w:val="18"/>
-        </w:rPr>
-        <w:t>codes-trial.vercel.app</w:t>
+        <w:t>Built a 6-step AI pipeline: resume upload and extraction via PyPDF2, full intelligence report (score, strengths, weaknesses, ATS check), live job discovery, skills gap analysis, and personalized cover letter generation.</w:t>
       </w:r>
     </w:p>
     <w:p>
@@ -589,7 +628,7 @@
           <w:sz w:val="19"/>
           <w:szCs w:val="19"/>
         </w:rPr>
-        <w:t>Built an AI-powered dungeon-themed code roaster using FastAPI and Groq LLaMA 3.3-70b; users paste code or submit a GitHub repo URL to receive a brutal AI-generated verdict with three configurable severity levels.</w:t>
+        <w:t>Integrated Apify for real-time job scraping across LinkedIn, Naukri, Internshala, Glassdoor, Wellfound, and Indeed, filtered by role, location, stipend, and work mode.</w:t>
       </w:r>
     </w:p>
     <w:p>
@@ -607,7 +646,95 @@
           <w:sz w:val="19"/>
           <w:szCs w:val="19"/>
         </w:rPr>
-        <w:t>Designed FastAPI REST endpoints (/roast, /roast-github) with Pydantic schema validation for structured code and GitHub URL input handling.</w:t>
+        <w:t>Implemented dual AI engine with Groq LLaMA 3.3 70B as primary for sub-second responses and Google Gemini as resilient fallback; secured with JWT auth and PostgreSQL (NeonDB) on Railway + Vercel deployment.</w:t>
+      </w:r>
+    </w:p>
+    <w:p>
+      <w:pPr>
+        <w:spacing w:before="60" w:after="10"/>
+      </w:pPr>
+      <w:r>
+        <w:rPr>
+          <w:b/>
+          <w:bCs/>
+          <w:color w:val="1A1A1A"/>
+          <w:sz w:val="20"/>
+        </w:rPr>
+        <w:t>CodesTrial – AI-Powered Code Roasting Platform</w:t>
+      </w:r>
+    </w:p>
+    <w:p>
+      <w:pPr>
+        <w:spacing w:after="8"/>
+      </w:pPr>
+      <w:r>
+        <w:rPr>
+          <w:b/>
+          <w:bCs/>
+          <w:color w:val="555555"/>
+          <w:sz w:val="18"/>
+          <w:szCs w:val="18"/>
+        </w:rPr>
+        <w:t xml:space="preserve">Tech Stack: </w:t>
+      </w:r>
+      <w:r>
+        <w:rPr>
+          <w:i/>
+          <w:iCs/>
+          <w:color w:val="555555"/>
+          <w:sz w:val="18"/>
+          <w:szCs w:val="18"/>
+        </w:rPr>
+        <w:t>Python, FastAPI, Pydantic, React 18, Vite, Groq LLaMA 3.3, Imgflip API</w:t>
+      </w:r>
+    </w:p>
+    <w:p>
+      <w:pPr>
+        <w:spacing w:after="12"/>
+      </w:pPr>
+      <w:r>
+        <w:rPr>
+          <w:b/>
+          <w:bCs/>
+          <w:color w:val="555555"/>
+          <w:sz w:val="18"/>
+          <w:szCs w:val="18"/>
+        </w:rPr>
+        <w:t xml:space="preserve">GitHub: </w:t>
+      </w:r>
+      <w:r>
+        <w:rPr>
+          <w:color w:val="1155CC"/>
+          <w:sz w:val="18"/>
+          <w:szCs w:val="18"/>
+        </w:rPr>
+        <w:t>github.com/Sarthakk404/CodesTrial-AI-Powered-Code-Roasting</w:t>
+      </w:r>
+      <w:r>
+        <w:rPr>
+          <w:color w:val="555555"/>
+          <w:sz w:val="18"/>
+          <w:szCs w:val="18"/>
+        </w:rPr>
+        <w:t xml:space="preserve">   |   </w:t>
+      </w:r>
+      <w:r>
+        <w:rPr>
+          <w:b/>
+          <w:bCs/>
+          <w:color w:val="555555"/>
+          <w:sz w:val="18"/>
+          <w:szCs w:val="18"/>
+        </w:rPr>
+        <w:t xml:space="preserve">Live: </w:t>
+      </w:r>
+      <w:r>
+        <w:rPr>
+          <w:color w:val="1155CC"/>
+          <w:sz w:val="18"/>
+          <w:szCs w:val="18"/>
+        </w:rPr>
+        <w:t>codes-trial.vercel.app</w:t>
       </w:r>
     </w:p>
     <w:p>
@@ -625,7 +752,7 @@
           <w:sz w:val="19"/>
           <w:szCs w:val="19"/>
         </w:rPr>
-        <w:t>Integrated Imgflip API for dynamic meme generation alongside AI roast responses, combining LLM output with external media APIs.</w:t>
+        <w:t>Built an AI-powered dungeon-themed code roaster using FastAPI and Groq LLaMA 3.3-70b; users paste code or submit a GitHub repo URL to receive a brutal AI-generated verdict with three configurable severity levels.</w:t>
       </w:r>
     </w:p>
     <w:p>
@@ -643,7 +770,25 @@
           <w:sz w:val="19"/>
           <w:szCs w:val="19"/>
         </w:rPr>
-        <w:t>Built GitHub repo fetcher module to pull and analyze remote code directly from URLs, enabling repo-level roasting without manual code pasting.</w:t>
+        <w:t>Designed FastAPI REST endpoints (/roast, /roast-github) with Pydantic schema validation for structured code and GitHub URL input handling.</w:t>
+      </w:r>
+    </w:p>
+    <w:p>
+      <w:pPr>
+        <w:pStyle w:val="ListParagraph"/>
+        <w:numPr>
+          <w:ilvl w:val="0"/>
+          <w:numId w:val="1"/>
+        </w:numPr>
+        <w:spacing w:before="20" w:after="20"/>
+      </w:pPr>
+      <w:r>
+        <w:rPr>
+          <w:color w:val="1A1A1A"/>
+          <w:sz w:val="19"/>
+          <w:szCs w:val="19"/>
+        </w:rPr>
+        <w:t>Integrated Imgflip API for dynamic meme generation alongside AI roast responses</w:t>
       </w:r>
     </w:p>
     <w:p>
@@ -1399,7 +1544,6 @@
   <w:style w:type="character" w:default="1" w:styleId="DefaultParagraphFont">
     <w:name w:val="Default Paragraph Font"/>
     <w:uiPriority w:val="1"/>
-    <w:semiHidden/>
     <w:unhideWhenUsed/>
   </w:style>
   <w:style w:type="table" w:default="1" w:styleId="TableNormal">

</xml_diff>